<commit_message>
Portal 62: fix docxtpl {%- bug, add COMMITTEE_MEMBER_RE to viewer_router
Templates:
- Replace {%- if loop.first %} with {% if loop.first %} in all 6 FR.233
  templates to prevent docxtpl patch_xml from destroying the data row

viewer_router.py:
- Add COMMITTEE_MEMBER_RE regex for dynamic COMMITTEE_MEMBER_<auditor_id> keys
- _check_committee_sig: handle new-style dynamic keys with auditor_id match,
  snapshot verification, and admin bypass
- sign_confirm: include COMMITTEE_MEMBER_RE in eligibility branch
- _get_field_status: resolve status (signed/current_user/pending) from
  committee_members snapshot on AuditSet for dynamic keys
- _commit_existing_signing_record: extend elif to include COMMITTEE_MEMBER_RE;
  CM gate uses LIKE 'COMMITTEE_MEMBER_%' OR static keys for committee_signed
  and committee_total counts
</commit_message>
<xml_diff>
--- a/backend/uaf_blank_set/13485/Initial Certification /Stage 2/FR.233 Review And Decision Form R5&09.10.2025.docx
+++ b/backend/uaf_blank_set/13485/Initial Certification /Stage 2/FR.233 Review And Decision Form R5&09.10.2025.docx
@@ -3535,6 +3535,18 @@
         </w:tc>
       </w:tr>
       <w:tr>
+        <w:tc>
+          <w:tcPr>
+            <w:tcW w:w="0" w:type="auto"/>
+          </w:tcPr>
+          <w:p>
+            <w:r>
+              <w:t>{%tr for member in committee_members %}</w:t>
+            </w:r>
+          </w:p>
+        </w:tc>
+      </w:tr>
+      <w:tr>
         <w:trPr>
           <w:trHeight w:val="360"/>
         </w:trPr>
@@ -3562,13 +3574,7 @@
               </w:rPr>
             </w:pPr>
             <w:r>
-              <w:rPr>
-                <w:rFonts w:ascii="Times New Roman" w:eastAsia="Times New Roman" w:hAnsi="Times New Roman" w:cs="Times New Roman"/>
-                <w:sz w:val="20"/>
-                <w:szCs w:val="20"/>
-                <w:lang w:val="en-US" w:eastAsia="tr-TR"/>
-              </w:rPr>
-              <w:t>Chairperson</w:t>
+              <w:t xml:space="preserve">{% if loop.first %}Chairperson{% else %}Member{% endif %} / {{ member.name }}</w:t>
             </w:r>
           </w:p>
         </w:tc>
@@ -3595,6 +3601,9 @@
                 <w:lang w:val="en-US" w:eastAsia="tr-TR"/>
               </w:rPr>
             </w:pPr>
+            <w:r>
+              <w:t xml:space="preserve">{{ member.ea_codes_str }}</w:t>
+            </w:r>
           </w:p>
         </w:tc>
         <w:tc>
@@ -3646,284 +3655,19 @@
               </w:rPr>
             </w:pPr>
             <w:r>
-              <w:rPr>
-                <w:rFonts w:ascii="Times New Roman" w:eastAsia="Times New Roman" w:hAnsi="Times New Roman" w:cs="Times New Roman"/>
-                <w:color w:val="000000"/>
-                <w:sz w:val="20"/>
-                <w:szCs w:val="20"/>
-                <w:lang w:val="en-US" w:eastAsia="tr-TR"/>
-              </w:rPr>
-              <w:t> </w:t>
+              <w:t xml:space="preserve">[SIG:COMMITTEE_MEMBER_{{ member.id }}]</w:t>
             </w:r>
           </w:p>
         </w:tc>
       </w:tr>
       <w:tr>
-        <w:trPr>
-          <w:trHeight w:val="315"/>
-        </w:trPr>
-        <w:tc>
-          <w:tcPr>
-            <w:tcW w:w="3092" w:type="dxa"/>
-            <w:tcBorders>
-              <w:top w:val="single" w:sz="4" w:space="0" w:color="auto"/>
-              <w:left w:val="single" w:sz="4" w:space="0" w:color="auto"/>
-              <w:bottom w:val="single" w:sz="4" w:space="0" w:color="auto"/>
-              <w:right w:val="single" w:sz="4" w:space="0" w:color="auto"/>
-            </w:tcBorders>
-            <w:shd w:val="clear" w:color="auto" w:fill="DEEAF6"/>
-            <w:vAlign w:val="center"/>
-            <w:hideMark/>
-          </w:tcPr>
-          <w:p>
-            <w:pPr>
-              <w:spacing w:after="0" w:line="240" w:lineRule="auto"/>
-              <w:rPr>
-                <w:rFonts w:ascii="Times New Roman" w:eastAsia="Times New Roman" w:hAnsi="Times New Roman" w:cs="Times New Roman"/>
-                <w:sz w:val="20"/>
-                <w:szCs w:val="20"/>
-                <w:lang w:val="en-US" w:eastAsia="tr-TR"/>
-              </w:rPr>
-            </w:pPr>
-            <w:r>
-              <w:rPr>
-                <w:rFonts w:ascii="Times New Roman" w:eastAsia="Times New Roman" w:hAnsi="Times New Roman" w:cs="Times New Roman"/>
-                <w:sz w:val="20"/>
-                <w:szCs w:val="20"/>
-                <w:lang w:val="en-US" w:eastAsia="tr-TR"/>
-              </w:rPr>
-              <w:t>Member</w:t>
-            </w:r>
-          </w:p>
-        </w:tc>
-        <w:tc>
-          <w:tcPr>
-            <w:tcW w:w="2165" w:type="dxa"/>
-            <w:gridSpan w:val="2"/>
-            <w:tcBorders>
-              <w:top w:val="single" w:sz="4" w:space="0" w:color="auto"/>
-              <w:left w:val="nil"/>
-              <w:bottom w:val="single" w:sz="4" w:space="0" w:color="auto"/>
-              <w:right w:val="single" w:sz="4" w:space="0" w:color="auto"/>
-            </w:tcBorders>
-            <w:vAlign w:val="center"/>
-          </w:tcPr>
-          <w:p>
-            <w:pPr>
-              <w:spacing w:after="0" w:line="240" w:lineRule="auto"/>
-              <w:rPr>
-                <w:rFonts w:ascii="Times New Roman" w:eastAsia="Times New Roman" w:hAnsi="Times New Roman" w:cs="Times New Roman"/>
-                <w:color w:val="000000"/>
-                <w:sz w:val="20"/>
-                <w:szCs w:val="20"/>
-                <w:lang w:val="en-US" w:eastAsia="tr-TR"/>
-              </w:rPr>
-            </w:pPr>
-          </w:p>
-        </w:tc>
-        <w:tc>
-          <w:tcPr>
-            <w:tcW w:w="2657" w:type="dxa"/>
-            <w:gridSpan w:val="2"/>
-            <w:tcBorders>
-              <w:top w:val="single" w:sz="4" w:space="0" w:color="auto"/>
-              <w:left w:val="nil"/>
-              <w:bottom w:val="single" w:sz="4" w:space="0" w:color="auto"/>
-              <w:right w:val="single" w:sz="4" w:space="0" w:color="auto"/>
-            </w:tcBorders>
-            <w:vAlign w:val="center"/>
-          </w:tcPr>
-          <w:p>
-            <w:pPr>
-              <w:spacing w:after="0" w:line="240" w:lineRule="auto"/>
-              <w:rPr>
-                <w:rFonts w:ascii="Times New Roman" w:eastAsia="Times New Roman" w:hAnsi="Times New Roman" w:cs="Times New Roman"/>
-                <w:color w:val="000000"/>
-                <w:sz w:val="20"/>
-                <w:szCs w:val="20"/>
-                <w:lang w:val="en-US" w:eastAsia="tr-TR"/>
-              </w:rPr>
-            </w:pPr>
-          </w:p>
-        </w:tc>
-        <w:tc>
-          <w:tcPr>
-            <w:tcW w:w="2293" w:type="dxa"/>
-            <w:tcBorders>
-              <w:top w:val="single" w:sz="4" w:space="0" w:color="auto"/>
-              <w:left w:val="nil"/>
-              <w:bottom w:val="single" w:sz="4" w:space="0" w:color="auto"/>
-              <w:right w:val="single" w:sz="4" w:space="0" w:color="auto"/>
-            </w:tcBorders>
-            <w:vAlign w:val="center"/>
-            <w:hideMark/>
-          </w:tcPr>
-          <w:p>
-            <w:pPr>
-              <w:spacing w:after="0" w:line="240" w:lineRule="auto"/>
-              <w:rPr>
-                <w:rFonts w:ascii="Times New Roman" w:eastAsia="Times New Roman" w:hAnsi="Times New Roman" w:cs="Times New Roman"/>
-                <w:color w:val="000000"/>
-                <w:sz w:val="20"/>
-                <w:szCs w:val="20"/>
-                <w:lang w:val="en-US" w:eastAsia="tr-TR"/>
-              </w:rPr>
-            </w:pPr>
-            <w:r>
-              <w:rPr>
-                <w:rFonts w:ascii="Times New Roman" w:eastAsia="Times New Roman" w:hAnsi="Times New Roman" w:cs="Times New Roman"/>
-                <w:color w:val="000000"/>
-                <w:sz w:val="20"/>
-                <w:szCs w:val="20"/>
-                <w:lang w:val="en-US" w:eastAsia="tr-TR"/>
-              </w:rPr>
-              <w:t> </w:t>
-            </w:r>
-          </w:p>
-        </w:tc>
-      </w:tr>
-      <w:tr>
-        <w:trPr>
-          <w:trHeight w:val="398"/>
-        </w:trPr>
-        <w:tc>
-          <w:tcPr>
-            <w:tcW w:w="3092" w:type="dxa"/>
-            <w:tcBorders>
-              <w:top w:val="single" w:sz="4" w:space="0" w:color="auto"/>
-              <w:left w:val="single" w:sz="4" w:space="0" w:color="auto"/>
-              <w:bottom w:val="single" w:sz="4" w:space="0" w:color="auto"/>
-              <w:right w:val="single" w:sz="4" w:space="0" w:color="auto"/>
-            </w:tcBorders>
-            <w:shd w:val="clear" w:color="auto" w:fill="DEEAF6"/>
-            <w:vAlign w:val="center"/>
-            <w:hideMark/>
-          </w:tcPr>
-          <w:p>
-            <w:pPr>
-              <w:spacing w:after="0" w:line="240" w:lineRule="auto"/>
-              <w:rPr>
-                <w:rFonts w:ascii="Times New Roman" w:eastAsia="Times New Roman" w:hAnsi="Times New Roman" w:cs="Times New Roman"/>
-                <w:sz w:val="20"/>
-                <w:szCs w:val="20"/>
-                <w:lang w:val="en-US" w:eastAsia="tr-TR"/>
-              </w:rPr>
-            </w:pPr>
-            <w:r>
-              <w:rPr>
-                <w:rFonts w:ascii="Times New Roman" w:eastAsia="Times New Roman" w:hAnsi="Times New Roman" w:cs="Times New Roman"/>
-                <w:sz w:val="20"/>
-                <w:szCs w:val="20"/>
-                <w:lang w:val="en-US" w:eastAsia="tr-TR"/>
-              </w:rPr>
-              <w:t>Member</w:t>
-            </w:r>
-          </w:p>
-        </w:tc>
-        <w:tc>
-          <w:tcPr>
-            <w:tcW w:w="2165" w:type="dxa"/>
-            <w:gridSpan w:val="2"/>
-            <w:tcBorders>
-              <w:top w:val="single" w:sz="4" w:space="0" w:color="auto"/>
-              <w:left w:val="nil"/>
-              <w:bottom w:val="single" w:sz="4" w:space="0" w:color="auto"/>
-              <w:right w:val="single" w:sz="4" w:space="0" w:color="auto"/>
-            </w:tcBorders>
-            <w:vAlign w:val="center"/>
-            <w:hideMark/>
-          </w:tcPr>
-          <w:p>
-            <w:pPr>
-              <w:spacing w:after="0" w:line="240" w:lineRule="auto"/>
-              <w:rPr>
-                <w:rFonts w:ascii="Times New Roman" w:eastAsia="Times New Roman" w:hAnsi="Times New Roman" w:cs="Times New Roman"/>
-                <w:color w:val="000000"/>
-                <w:sz w:val="20"/>
-                <w:szCs w:val="20"/>
-                <w:lang w:val="en-US" w:eastAsia="tr-TR"/>
-              </w:rPr>
-            </w:pPr>
-            <w:r>
-              <w:rPr>
-                <w:rFonts w:ascii="Times New Roman" w:eastAsia="Times New Roman" w:hAnsi="Times New Roman" w:cs="Times New Roman"/>
-                <w:color w:val="000000"/>
-                <w:sz w:val="20"/>
-                <w:szCs w:val="20"/>
-                <w:lang w:val="en-US" w:eastAsia="tr-TR"/>
-              </w:rPr>
-              <w:t> </w:t>
-            </w:r>
-          </w:p>
-        </w:tc>
-        <w:tc>
-          <w:tcPr>
-            <w:tcW w:w="2657" w:type="dxa"/>
-            <w:gridSpan w:val="2"/>
-            <w:tcBorders>
-              <w:top w:val="single" w:sz="4" w:space="0" w:color="auto"/>
-              <w:left w:val="nil"/>
-              <w:bottom w:val="single" w:sz="4" w:space="0" w:color="auto"/>
-              <w:right w:val="single" w:sz="4" w:space="0" w:color="auto"/>
-            </w:tcBorders>
-            <w:vAlign w:val="center"/>
-            <w:hideMark/>
-          </w:tcPr>
-          <w:p>
-            <w:pPr>
-              <w:spacing w:after="0" w:line="240" w:lineRule="auto"/>
-              <w:rPr>
-                <w:rFonts w:ascii="Times New Roman" w:eastAsia="Times New Roman" w:hAnsi="Times New Roman" w:cs="Times New Roman"/>
-                <w:color w:val="000000"/>
-                <w:sz w:val="20"/>
-                <w:szCs w:val="20"/>
-                <w:lang w:val="en-US" w:eastAsia="tr-TR"/>
-              </w:rPr>
-            </w:pPr>
-            <w:r>
-              <w:rPr>
-                <w:rFonts w:ascii="Times New Roman" w:eastAsia="Times New Roman" w:hAnsi="Times New Roman" w:cs="Times New Roman"/>
-                <w:color w:val="000000"/>
-                <w:sz w:val="20"/>
-                <w:szCs w:val="20"/>
-                <w:lang w:val="en-US" w:eastAsia="tr-TR"/>
-              </w:rPr>
-              <w:t> </w:t>
-            </w:r>
-          </w:p>
-        </w:tc>
-        <w:tc>
-          <w:tcPr>
-            <w:tcW w:w="2293" w:type="dxa"/>
-            <w:tcBorders>
-              <w:top w:val="single" w:sz="4" w:space="0" w:color="auto"/>
-              <w:left w:val="nil"/>
-              <w:bottom w:val="single" w:sz="4" w:space="0" w:color="auto"/>
-              <w:right w:val="single" w:sz="4" w:space="0" w:color="auto"/>
-            </w:tcBorders>
-            <w:vAlign w:val="center"/>
-            <w:hideMark/>
-          </w:tcPr>
-          <w:p>
-            <w:pPr>
-              <w:spacing w:after="0" w:line="240" w:lineRule="auto"/>
-              <w:rPr>
-                <w:rFonts w:ascii="Times New Roman" w:eastAsia="Times New Roman" w:hAnsi="Times New Roman" w:cs="Times New Roman"/>
-                <w:color w:val="000000"/>
-                <w:sz w:val="20"/>
-                <w:szCs w:val="20"/>
-                <w:lang w:val="en-US" w:eastAsia="tr-TR"/>
-              </w:rPr>
-            </w:pPr>
-            <w:r>
-              <w:rPr>
-                <w:rFonts w:ascii="Times New Roman" w:eastAsia="Times New Roman" w:hAnsi="Times New Roman" w:cs="Times New Roman"/>
-                <w:color w:val="000000"/>
-                <w:sz w:val="20"/>
-                <w:szCs w:val="20"/>
-                <w:lang w:val="en-US" w:eastAsia="tr-TR"/>
-              </w:rPr>
-              <w:t> </w:t>
+        <w:tc>
+          <w:tcPr>
+            <w:tcW w:w="0" w:type="auto"/>
+          </w:tcPr>
+          <w:p>
+            <w:r>
+              <w:t>{%tr endfor %}</w:t>
             </w:r>
           </w:p>
         </w:tc>

</xml_diff>

<commit_message>
Portal 125: FR.233 blank release + template cleanup
Templates: replace Jinja2 table-row loop syntax in Table 3 with static
  committee slots [SIG:COMMITTEE_CHAIR/MEMBER_1/MEMBER_2]; fix CM key
  from CERT_MANAGER_REVIEW → CERT_MANAGER_FR233 in all 6 blank files.
committee_router: add POST /fr233/release endpoint — no committee gate,
  retroactive released_at, preserves existing date on re-release.
  generate_fr233: preserve existing released_at when re-generating;
  relax committee hard gate (blank rows render for unset slots).
FR233Panel.tsx: replace upload-or-generate with date-picker + release
  button; re-generate demoted to optional "fill member names" action.

Co-Authored-By: Claude Opus 4.6 (1M context) <noreply@anthropic.com>
</commit_message>
<xml_diff>
--- a/backend/uaf_blank_set/13485/Initial Certification /Stage 2/FR.233 Review And Decision Form R5&09.10.2025.docx
+++ b/backend/uaf_blank_set/13485/Initial Certification /Stage 2/FR.233 Review And Decision Form R5&09.10.2025.docx
@@ -3538,18 +3538,6 @@
         </w:tc>
       </w:tr>
       <w:tr>
-        <w:tc>
-          <w:tcPr>
-            <w:tcW w:w="0" w:type="auto"/>
-          </w:tcPr>
-          <w:p>
-            <w:r>
-              <w:t>{%tr for member in committee_members %}</w:t>
-            </w:r>
-          </w:p>
-        </w:tc>
-      </w:tr>
-      <w:tr>
         <w:trPr>
           <w:trHeight w:val="360"/>
         </w:trPr>
@@ -3577,7 +3565,7 @@
               </w:rPr>
             </w:pPr>
             <w:r>
-              <w:t xml:space="preserve">{% if loop.first %}Chairperson{% else %}Member{% endif %}</w:t>
+              <w:t xml:space="preserve">Chairperson</w:t>
             </w:r>
           </w:p>
         </w:tc>
@@ -3604,9 +3592,6 @@
                 <w:lang w:val="en-US" w:eastAsia="tr-TR"/>
               </w:rPr>
             </w:pPr>
-            <w:r>
-              <w:t xml:space="preserve">{{ member.name }}</w:t>
-            </w:r>
           </w:p>
         </w:tc>
         <w:tc>
@@ -3632,9 +3617,6 @@
                 <w:lang w:val="en-US" w:eastAsia="tr-TR"/>
               </w:rPr>
             </w:pPr>
-            <w:r>
-              <w:t>{{ member.ea_codes_str }}</w:t>
-            </w:r>
           </w:p>
         </w:tc>
         <w:tc>
@@ -3661,19 +3643,229 @@
               </w:rPr>
             </w:pPr>
             <w:r>
-              <w:t xml:space="preserve">[SIG:COMMITTEE_MEMBER_{{ member.id }}]</w:t>
+              <w:t xml:space="preserve">[SIG:COMMITTEE_CHAIR]</w:t>
             </w:r>
           </w:p>
         </w:tc>
       </w:tr>
       <w:tr>
-        <w:tc>
-          <w:tcPr>
-            <w:tcW w:w="0" w:type="auto"/>
-          </w:tcPr>
-          <w:p>
-            <w:r>
-              <w:t>{%tr endfor %}</w:t>
+        <w:trPr>
+          <w:trHeight w:val="360"/>
+        </w:trPr>
+        <w:tc>
+          <w:tcPr>
+            <w:tcW w:w="3092" w:type="dxa"/>
+            <w:tcBorders>
+              <w:top w:val="single" w:sz="4" w:space="0" w:color="auto"/>
+              <w:left w:val="single" w:sz="4" w:space="0" w:color="auto"/>
+              <w:bottom w:val="single" w:sz="4" w:space="0" w:color="auto"/>
+              <w:right w:val="single" w:sz="4" w:space="0" w:color="auto"/>
+            </w:tcBorders>
+            <w:shd w:val="clear" w:color="auto" w:fill="DEEAF6"/>
+            <w:vAlign w:val="center"/>
+            <w:hideMark/>
+          </w:tcPr>
+          <w:p>
+            <w:pPr>
+              <w:spacing w:after="0" w:line="240" w:lineRule="auto"/>
+              <w:rPr>
+                <w:rFonts w:ascii="Times New Roman" w:eastAsia="Times New Roman" w:hAnsi="Times New Roman" w:cs="Times New Roman"/>
+                <w:sz w:val="20"/>
+                <w:szCs w:val="20"/>
+                <w:lang w:val="en-US" w:eastAsia="tr-TR"/>
+              </w:rPr>
+            </w:pPr>
+            <w:r>
+              <w:t xml:space="preserve">Member</w:t>
+            </w:r>
+          </w:p>
+        </w:tc>
+        <w:tc>
+          <w:tcPr>
+            <w:tcW w:w="2165" w:type="dxa"/>
+            <w:gridSpan w:val="2"/>
+            <w:tcBorders>
+              <w:top w:val="single" w:sz="4" w:space="0" w:color="auto"/>
+              <w:left w:val="nil"/>
+              <w:bottom w:val="single" w:sz="4" w:space="0" w:color="auto"/>
+              <w:right w:val="single" w:sz="4" w:space="0" w:color="auto"/>
+            </w:tcBorders>
+            <w:vAlign w:val="center"/>
+          </w:tcPr>
+          <w:p>
+            <w:pPr>
+              <w:spacing w:after="0" w:line="240" w:lineRule="auto"/>
+              <w:rPr>
+                <w:rFonts w:ascii="Times New Roman" w:eastAsia="Times New Roman" w:hAnsi="Times New Roman" w:cs="Times New Roman"/>
+                <w:color w:val="000000"/>
+                <w:sz w:val="20"/>
+                <w:szCs w:val="20"/>
+                <w:lang w:val="en-US" w:eastAsia="tr-TR"/>
+              </w:rPr>
+            </w:pPr>
+          </w:p>
+        </w:tc>
+        <w:tc>
+          <w:tcPr>
+            <w:tcW w:w="2657" w:type="dxa"/>
+            <w:gridSpan w:val="2"/>
+            <w:tcBorders>
+              <w:top w:val="single" w:sz="4" w:space="0" w:color="auto"/>
+              <w:left w:val="nil"/>
+              <w:bottom w:val="single" w:sz="4" w:space="0" w:color="auto"/>
+              <w:right w:val="single" w:sz="4" w:space="0" w:color="auto"/>
+            </w:tcBorders>
+            <w:vAlign w:val="center"/>
+          </w:tcPr>
+          <w:p>
+            <w:pPr>
+              <w:spacing w:after="0" w:line="240" w:lineRule="auto"/>
+              <w:rPr>
+                <w:rFonts w:ascii="Times New Roman" w:eastAsia="Times New Roman" w:hAnsi="Times New Roman" w:cs="Times New Roman"/>
+                <w:color w:val="000000"/>
+                <w:sz w:val="20"/>
+                <w:szCs w:val="20"/>
+                <w:lang w:val="en-US" w:eastAsia="tr-TR"/>
+              </w:rPr>
+            </w:pPr>
+          </w:p>
+        </w:tc>
+        <w:tc>
+          <w:tcPr>
+            <w:tcW w:w="2293" w:type="dxa"/>
+            <w:tcBorders>
+              <w:top w:val="single" w:sz="4" w:space="0" w:color="auto"/>
+              <w:left w:val="nil"/>
+              <w:bottom w:val="single" w:sz="4" w:space="0" w:color="auto"/>
+              <w:right w:val="single" w:sz="4" w:space="0" w:color="auto"/>
+            </w:tcBorders>
+            <w:vAlign w:val="center"/>
+            <w:hideMark/>
+          </w:tcPr>
+          <w:p>
+            <w:pPr>
+              <w:spacing w:after="0" w:line="240" w:lineRule="auto"/>
+              <w:rPr>
+                <w:rFonts w:ascii="Times New Roman" w:eastAsia="Times New Roman" w:hAnsi="Times New Roman" w:cs="Times New Roman"/>
+                <w:color w:val="000000"/>
+                <w:sz w:val="20"/>
+                <w:szCs w:val="20"/>
+                <w:lang w:val="en-US" w:eastAsia="tr-TR"/>
+              </w:rPr>
+            </w:pPr>
+            <w:r>
+              <w:t xml:space="preserve">[SIG:COMMITTEE_MEMBER_1]</w:t>
+            </w:r>
+          </w:p>
+        </w:tc>
+      </w:tr>
+      <w:tr>
+        <w:trPr>
+          <w:trHeight w:val="360"/>
+        </w:trPr>
+        <w:tc>
+          <w:tcPr>
+            <w:tcW w:w="3092" w:type="dxa"/>
+            <w:tcBorders>
+              <w:top w:val="single" w:sz="4" w:space="0" w:color="auto"/>
+              <w:left w:val="single" w:sz="4" w:space="0" w:color="auto"/>
+              <w:bottom w:val="single" w:sz="4" w:space="0" w:color="auto"/>
+              <w:right w:val="single" w:sz="4" w:space="0" w:color="auto"/>
+            </w:tcBorders>
+            <w:shd w:val="clear" w:color="auto" w:fill="DEEAF6"/>
+            <w:vAlign w:val="center"/>
+            <w:hideMark/>
+          </w:tcPr>
+          <w:p>
+            <w:pPr>
+              <w:spacing w:after="0" w:line="240" w:lineRule="auto"/>
+              <w:rPr>
+                <w:rFonts w:ascii="Times New Roman" w:eastAsia="Times New Roman" w:hAnsi="Times New Roman" w:cs="Times New Roman"/>
+                <w:sz w:val="20"/>
+                <w:szCs w:val="20"/>
+                <w:lang w:val="en-US" w:eastAsia="tr-TR"/>
+              </w:rPr>
+            </w:pPr>
+            <w:r>
+              <w:t xml:space="preserve">Member</w:t>
+            </w:r>
+          </w:p>
+        </w:tc>
+        <w:tc>
+          <w:tcPr>
+            <w:tcW w:w="2165" w:type="dxa"/>
+            <w:gridSpan w:val="2"/>
+            <w:tcBorders>
+              <w:top w:val="single" w:sz="4" w:space="0" w:color="auto"/>
+              <w:left w:val="nil"/>
+              <w:bottom w:val="single" w:sz="4" w:space="0" w:color="auto"/>
+              <w:right w:val="single" w:sz="4" w:space="0" w:color="auto"/>
+            </w:tcBorders>
+            <w:vAlign w:val="center"/>
+          </w:tcPr>
+          <w:p>
+            <w:pPr>
+              <w:spacing w:after="0" w:line="240" w:lineRule="auto"/>
+              <w:rPr>
+                <w:rFonts w:ascii="Times New Roman" w:eastAsia="Times New Roman" w:hAnsi="Times New Roman" w:cs="Times New Roman"/>
+                <w:color w:val="000000"/>
+                <w:sz w:val="20"/>
+                <w:szCs w:val="20"/>
+                <w:lang w:val="en-US" w:eastAsia="tr-TR"/>
+              </w:rPr>
+            </w:pPr>
+          </w:p>
+        </w:tc>
+        <w:tc>
+          <w:tcPr>
+            <w:tcW w:w="2657" w:type="dxa"/>
+            <w:gridSpan w:val="2"/>
+            <w:tcBorders>
+              <w:top w:val="single" w:sz="4" w:space="0" w:color="auto"/>
+              <w:left w:val="nil"/>
+              <w:bottom w:val="single" w:sz="4" w:space="0" w:color="auto"/>
+              <w:right w:val="single" w:sz="4" w:space="0" w:color="auto"/>
+            </w:tcBorders>
+            <w:vAlign w:val="center"/>
+          </w:tcPr>
+          <w:p>
+            <w:pPr>
+              <w:spacing w:after="0" w:line="240" w:lineRule="auto"/>
+              <w:rPr>
+                <w:rFonts w:ascii="Times New Roman" w:eastAsia="Times New Roman" w:hAnsi="Times New Roman" w:cs="Times New Roman"/>
+                <w:color w:val="000000"/>
+                <w:sz w:val="20"/>
+                <w:szCs w:val="20"/>
+                <w:lang w:val="en-US" w:eastAsia="tr-TR"/>
+              </w:rPr>
+            </w:pPr>
+          </w:p>
+        </w:tc>
+        <w:tc>
+          <w:tcPr>
+            <w:tcW w:w="2293" w:type="dxa"/>
+            <w:tcBorders>
+              <w:top w:val="single" w:sz="4" w:space="0" w:color="auto"/>
+              <w:left w:val="nil"/>
+              <w:bottom w:val="single" w:sz="4" w:space="0" w:color="auto"/>
+              <w:right w:val="single" w:sz="4" w:space="0" w:color="auto"/>
+            </w:tcBorders>
+            <w:vAlign w:val="center"/>
+            <w:hideMark/>
+          </w:tcPr>
+          <w:p>
+            <w:pPr>
+              <w:spacing w:after="0" w:line="240" w:lineRule="auto"/>
+              <w:rPr>
+                <w:rFonts w:ascii="Times New Roman" w:eastAsia="Times New Roman" w:hAnsi="Times New Roman" w:cs="Times New Roman"/>
+                <w:color w:val="000000"/>
+                <w:sz w:val="20"/>
+                <w:szCs w:val="20"/>
+                <w:lang w:val="en-US" w:eastAsia="tr-TR"/>
+              </w:rPr>
+            </w:pPr>
+            <w:r>
+              <w:t xml:space="preserve">[SIG:COMMITTEE_MEMBER_2]</w:t>
             </w:r>
           </w:p>
         </w:tc>
@@ -3851,13 +4043,7 @@
               </w:rPr>
             </w:pPr>
             <w:r>
-              <w:rPr>
-                <w:rFonts w:ascii="Times New Roman" w:hAnsi="Times New Roman"/>
-                <w:i/>
-                <w:color w:val="B4B4B4"/>
-                <w:sz w:val="20"/>
-              </w:rPr>
-              <w:t>[SIG:CERT_MANAGER_REVIEW]</w:t>
+              <w:t xml:space="preserve">[SIG:CERT_MANAGER_FR233]</w:t>
             </w:r>
           </w:p>
         </w:tc>

</xml_diff>